<commit_message>
Distinguish DoS (valid labels) from Impersonation (label leakage); add talk script and leakage demo
- Report, REPORT_NOTES, data report, notebook: DoS labelling by ID 0x000 is
  correct (no real ECU uses it) but trivial; Impersonation labelled by a
  legitimate ID covers genuine ECU frames, so that result is label leakage
- Correct an overclaim: the paper describes no validation split (test-set
  leakage cannot be ruled out), rather than "tuned on its test set"
- Talk_Script.docx (scripts/make_talk_script.py): spoken walkthrough with a
  dataset section, paper-vs-project table, likely questions, key numbers
- leakage_demo.ipynb (scripts/make_leakage_demo.py): live demonstration of the
  ID-label relationship, with the paper's own quotes
- Docx builder skips files that are open in Word instead of failing

Co-Authored-By: Claude Opus 5.5 <noreply@anthropic.com>
Claude-Session: https://claude.ai/code/session_01PejWNbcXkpfmHZ5QRC9dJV
</commit_message>
<xml_diff>
--- a/results/AAT_Report.docx
+++ b/results/AAT_Report.docx
@@ -57,7 +57,7 @@
         <w:jc w:val="center"/>
       </w:pPr>
       <w:r>
-        <w:t>22 October 2026</w:t>
+        <w:t>30 October 2026</w:t>
       </w:r>
     </w:p>
     <w:p/>
@@ -115,7 +115,7 @@
         <w:t>reproduce</w:t>
       </w:r>
       <w:r>
-        <w:t xml:space="preserve"> (our ANFIS-FCM+stk: 99.99 % binary, 100 % multiclass accuracy), but the data analysis shows why: the class label is a function of the CAN ID, which is also an input. On a fairer benchmark that removes the ID (</w:t>
+        <w:t xml:space="preserve"> (our ANFIS-FCM+stk: 99.99 % binary, 100 % multiclass accuracy), but the data analysis shows why: the paper labels the classes by CAN ID, which is also an input. For DoS this is correct (no real ECU uses ID 0x000) but makes detection trivial. For Impersonation, which uses a legitimate ID, it also labels the genuine ECU's frames as attacks, so that result measures ID recognition: label leakage. On a fairer benchmark that removes the ID (</w:t>
       </w:r>
       <w:r>
         <w:rPr>
@@ -922,7 +922,16 @@
         <w:t>DoS is genuinely distinct.</w:t>
       </w:r>
       <w:r>
-        <w:t xml:space="preserve"> The DoS log contains 335,624 injected 0x000 frames with a single all-zero payload, in bursts (median gap 0.5 ms), throughout the log. However, all-zero payloads also occur on normal IDs (159,104 such frames in the attack-free log), so without the ID, DoS must be recognised partly by timing.</w:t>
+        <w:t xml:space="preserve"> The DoS log contains 335,624 injected 0x000 frames with a single all-zero payload, in bursts (median gap 0.5 ms), throughout the log. However, all-zero payloads also occur on normal IDs (159,104 such frames in the attack-free log), so without the ID, DoS must be recognised partly by timing. No real ECU uses 0x000, so </w:t>
+      </w:r>
+      <w:r>
+        <w:rPr>
+          <w:b/>
+        </w:rPr>
+        <w:t>labelling 0x000 as DoS is correct</w:t>
+      </w:r>
+      <w:r>
+        <w:t>; with the ID as an input, DoS detection is simply trivial.</w:t>
       </w:r>
     </w:p>
     <w:p>
@@ -947,10 +956,10 @@
         <w:rPr>
           <w:b/>
         </w:rPr>
-        <w:t>Consequence.</w:t>
+        <w:t>Consequence: label leakage for Impersonation.</w:t>
       </w:r>
       <w:r>
-        <w:t xml:space="preserve"> The paper's Impersonation class is defined by the ID alone: genuine and malicious 0x164 frames share one label. With the CAN ID as an input feature, the task reduces to an ID lookup.</w:t>
+        <w:t xml:space="preserve"> 0x164 is a legitimate ID (5.3 % of the attack-free drive), and the dataset's own documentation notes that impersonation cannot be separated by ID. Yet the paper labels every 0x164 frame as an attack and also feeds the ID to the model (Section III-B, p. 90867). Genuine and malicious 0x164 frames share one label, and the Impersonation class reduces to an ID lookup.</w:t>
       </w:r>
     </w:p>
     <w:p>
@@ -12980,7 +12989,7 @@
         <w:t>The paper reproduces, but its headline is uninformative.</w:t>
       </w:r>
       <w:r>
-        <w:t xml:space="preserve"> With the ID as input and labels defined by the ID, almost any non-linear model reaches ≈100 %.</w:t>
+        <w:t xml:space="preserve"> With the ID as input and labels defined by the ID, almost any non-linear model reaches ≈100 %. The DoS results are valid but trivial; the Impersonation results are label leakage, not attack detection.</w:t>
       </w:r>
     </w:p>
     <w:p>
@@ -13054,7 +13063,7 @@
         <w:pStyle w:val="ListBullet"/>
       </w:pPr>
       <w:r>
-        <w:t>The paper tuned on its test set; we tune only on a validation split.</w:t>
+        <w:t>The paper describes no validation split, so test-set leakage cannot be ruled out; we tune only on a validation split.</w:t>
       </w:r>
     </w:p>
     <w:p>

</xml_diff>